<commit_message>
Regenerate Donor Guide PDF/DOCX with the now-framed email shot
Follow-up to 908de15 (apply-frame on the shared PasswordReset-Email
asset) - both handouts embedded the old unframed bytes since they were
built before that fix landed.

Co-Authored-By: Claude Sonnet 5 <noreply@anthropic.com>
</commit_message>
<xml_diff>
--- a/downloads/15706601/Navigating-AwardSpring-A-Guide-for-Donors.docx
+++ b/downloads/15706601/Navigating-AwardSpring-A-Guide-for-Donors.docx
@@ -251,7 +251,7 @@
       <w:r>
         <w:drawing>
           <wp:inline distT="0" distB="0" distL="0" distR="0">
-            <wp:extent cx="5715000" cy="4191000"/>
+            <wp:extent cx="5562600" cy="4191000"/>
             <wp:effectExtent t="0" r="0" b="0" l="0"/>
             <wp:docPr id="1" name="" descr="" title=""/>
             <wp:cNvGraphicFramePr>
@@ -276,7 +276,7 @@
                   <pic:spPr bwMode="auto">
                     <a:xfrm>
                       <a:off x="0" y="0"/>
-                      <a:ext cx="5715000" cy="4191000"/>
+                      <a:ext cx="5562600" cy="4191000"/>
                     </a:xfrm>
                     <a:prstGeom prst="rect">
                       <a:avLst/>

</xml_diff>